<commit_message>
deal screen: update cusp.docx
</commit_message>
<xml_diff>
--- a/hub/static/research/companies/cusp.docx
+++ b/hub/static/research/companies/cusp.docx
@@ -77,7 +77,7 @@
           <w:color w:val="1A1A1A"/>
           <w:sz w:val="32"/>
         </w:rPr>
-        <w:t>3.1 / 4.0</w:t>
+        <w:t>0.0 / 4.0</w:t>
       </w:r>
       <w:r>
         <w:rPr>
@@ -87,7 +87,7 @@
           <w:color w:val="828282"/>
           <w:sz w:val="21"/>
         </w:rPr>
-        <w:t xml:space="preserve">   (raw 3.1)</w:t>
+        <w:t xml:space="preserve">   (raw 0.0)</w:t>
       </w:r>
       <w:r>
         <w:rPr>
@@ -97,7 +97,7 @@
           <w:color w:val="828282"/>
           <w:sz w:val="21"/>
         </w:rPr>
-        <w:t xml:space="preserve">   —   CLEARS GATE · GO / IC REVIEW</w:t>
+        <w:t xml:space="preserve">   —   SCORING FAILED — NOT SCREENED</w:t>
       </w:r>
     </w:p>
     <w:tbl>
@@ -185,618 +185,6 @@
           </w:p>
         </w:tc>
       </w:tr>
-      <w:tr>
-        <w:tc>
-          <w:tcPr>
-            <w:tcW w:type="dxa" w:w="2664"/>
-            <w:shd w:val="clear" w:color="auto" w:fill="F5F5F5"/>
-            <w:tcMar>
-              <w:top w:w="40" w:type="dxa"/>
-              <w:bottom w:w="40" w:type="dxa"/>
-              <w:left w:w="60" w:type="dxa"/>
-              <w:right w:w="60" w:type="dxa"/>
-            </w:tcMar>
-            <w:tcBorders>
-              <w:top w:val="nil"/>
-              <w:left w:val="nil"/>
-              <w:right w:val="nil"/>
-              <w:bottom w:val="single" w:sz="4" w:color="E4DFD5"/>
-            </w:tcBorders>
-          </w:tcPr>
-          <w:p>
-            <w:r>
-              <w:rPr>
-                <w:rFonts w:ascii="Sora" w:hAnsi="Sora"/>
-                <w:b w:val="0"/>
-                <w:caps w:val="0"/>
-                <w:color w:val="1A1A1A"/>
-                <w:sz w:val="19"/>
-              </w:rPr>
-              <w:t>Lead / Round Dynamics</w:t>
-            </w:r>
-          </w:p>
-        </w:tc>
-        <w:tc>
-          <w:tcPr>
-            <w:tcW w:type="dxa" w:w="792"/>
-            <w:shd w:val="clear" w:color="auto" w:fill="F5F5F5"/>
-            <w:tcMar>
-              <w:top w:w="40" w:type="dxa"/>
-              <w:bottom w:w="40" w:type="dxa"/>
-              <w:left w:w="60" w:type="dxa"/>
-              <w:right w:w="60" w:type="dxa"/>
-            </w:tcMar>
-            <w:tcBorders>
-              <w:top w:val="nil"/>
-              <w:left w:val="nil"/>
-              <w:right w:val="nil"/>
-              <w:bottom w:val="single" w:sz="4" w:color="E4DFD5"/>
-            </w:tcBorders>
-          </w:tcPr>
-          <w:p>
-            <w:r>
-              <w:rPr>
-                <w:rFonts w:ascii="Sora" w:hAnsi="Sora"/>
-                <w:b/>
-                <w:caps w:val="0"/>
-                <w:color w:val="1A1A1A"/>
-                <w:sz w:val="19"/>
-              </w:rPr>
-              <w:t>3.2</w:t>
-            </w:r>
-            <w:r>
-              <w:rPr>
-                <w:rFonts w:ascii="Sora" w:hAnsi="Sora"/>
-                <w:b w:val="0"/>
-                <w:caps w:val="0"/>
-                <w:color w:val="828282"/>
-                <w:sz w:val="17"/>
-              </w:rPr>
-              <w:t xml:space="preserve"> / 4</w:t>
-            </w:r>
-          </w:p>
-        </w:tc>
-        <w:tc>
-          <w:tcPr>
-            <w:tcW w:type="dxa" w:w="5904"/>
-            <w:shd w:val="clear" w:color="auto" w:fill="F5F5F5"/>
-            <w:tcMar>
-              <w:top w:w="40" w:type="dxa"/>
-              <w:bottom w:w="40" w:type="dxa"/>
-              <w:left w:w="60" w:type="dxa"/>
-              <w:right w:w="60" w:type="dxa"/>
-            </w:tcMar>
-            <w:tcBorders>
-              <w:top w:val="nil"/>
-              <w:left w:val="nil"/>
-              <w:right w:val="nil"/>
-              <w:bottom w:val="single" w:sz="4" w:color="E4DFD5"/>
-            </w:tcBorders>
-          </w:tcPr>
-          <w:p>
-            <w:r>
-              <w:rPr>
-                <w:rFonts w:ascii="Sora" w:hAnsi="Sora"/>
-                <w:b w:val="0"/>
-                <w:caps w:val="0"/>
-                <w:color w:val="3C3C3C"/>
-                <w:sz w:val="18"/>
-              </w:rPr>
-              <w:t>New-money Tier 1 co-lead Kleiner Perkins with NEA re-up at a large Series B, strong prior Tier 1 backing, but domain-strategic signal limited.[3][4][10]</w:t>
-            </w:r>
-          </w:p>
-        </w:tc>
-      </w:tr>
-      <w:tr>
-        <w:tc>
-          <w:tcPr>
-            <w:tcW w:type="dxa" w:w="2664"/>
-            <w:shd w:val="clear" w:color="auto" w:fill="FFFFFF"/>
-            <w:tcMar>
-              <w:top w:w="40" w:type="dxa"/>
-              <w:bottom w:w="40" w:type="dxa"/>
-              <w:left w:w="60" w:type="dxa"/>
-              <w:right w:w="60" w:type="dxa"/>
-            </w:tcMar>
-            <w:tcBorders>
-              <w:top w:val="nil"/>
-              <w:left w:val="nil"/>
-              <w:right w:val="nil"/>
-              <w:bottom w:val="single" w:sz="4" w:color="E4DFD5"/>
-            </w:tcBorders>
-          </w:tcPr>
-          <w:p>
-            <w:r>
-              <w:rPr>
-                <w:rFonts w:ascii="Sora" w:hAnsi="Sora"/>
-                <w:b w:val="0"/>
-                <w:caps w:val="0"/>
-                <w:color w:val="1A1A1A"/>
-                <w:sz w:val="19"/>
-              </w:rPr>
-              <w:t>Founder / Team Quality</w:t>
-            </w:r>
-          </w:p>
-        </w:tc>
-        <w:tc>
-          <w:tcPr>
-            <w:tcW w:type="dxa" w:w="792"/>
-            <w:shd w:val="clear" w:color="auto" w:fill="FFFFFF"/>
-            <w:tcMar>
-              <w:top w:w="40" w:type="dxa"/>
-              <w:bottom w:w="40" w:type="dxa"/>
-              <w:left w:w="60" w:type="dxa"/>
-              <w:right w:w="60" w:type="dxa"/>
-            </w:tcMar>
-            <w:tcBorders>
-              <w:top w:val="nil"/>
-              <w:left w:val="nil"/>
-              <w:right w:val="nil"/>
-              <w:bottom w:val="single" w:sz="4" w:color="E4DFD5"/>
-            </w:tcBorders>
-          </w:tcPr>
-          <w:p>
-            <w:r>
-              <w:rPr>
-                <w:rFonts w:ascii="Sora" w:hAnsi="Sora"/>
-                <w:b/>
-                <w:caps w:val="0"/>
-                <w:color w:val="1A1A1A"/>
-                <w:sz w:val="19"/>
-              </w:rPr>
-              <w:t>3.3</w:t>
-            </w:r>
-            <w:r>
-              <w:rPr>
-                <w:rFonts w:ascii="Sora" w:hAnsi="Sora"/>
-                <w:b w:val="0"/>
-                <w:caps w:val="0"/>
-                <w:color w:val="828282"/>
-                <w:sz w:val="17"/>
-              </w:rPr>
-              <w:t xml:space="preserve"> / 4</w:t>
-            </w:r>
-          </w:p>
-        </w:tc>
-        <w:tc>
-          <w:tcPr>
-            <w:tcW w:type="dxa" w:w="5904"/>
-            <w:shd w:val="clear" w:color="auto" w:fill="FFFFFF"/>
-            <w:tcMar>
-              <w:top w:w="40" w:type="dxa"/>
-              <w:bottom w:w="40" w:type="dxa"/>
-              <w:left w:w="60" w:type="dxa"/>
-              <w:right w:w="60" w:type="dxa"/>
-            </w:tcMar>
-            <w:tcBorders>
-              <w:top w:val="nil"/>
-              <w:left w:val="nil"/>
-              <w:right w:val="nil"/>
-              <w:bottom w:val="single" w:sz="4" w:color="E4DFD5"/>
-            </w:tcBorders>
-          </w:tcPr>
-          <w:p>
-            <w:r>
-              <w:rPr>
-                <w:rFonts w:ascii="Sora" w:hAnsi="Sora"/>
-                <w:b w:val="0"/>
-                <w:caps w:val="0"/>
-                <w:color w:val="3C3C3C"/>
-                <w:sz w:val="18"/>
-              </w:rPr>
-              <w:t>World-class AI co-founder Max Welling and a growing multi-office team show strong domain authority and recruiting, though prior founder exit track record is limited.[5][6][17]</w:t>
-            </w:r>
-          </w:p>
-        </w:tc>
-      </w:tr>
-      <w:tr>
-        <w:tc>
-          <w:tcPr>
-            <w:tcW w:type="dxa" w:w="2664"/>
-            <w:shd w:val="clear" w:color="auto" w:fill="F5F5F5"/>
-            <w:tcMar>
-              <w:top w:w="40" w:type="dxa"/>
-              <w:bottom w:w="40" w:type="dxa"/>
-              <w:left w:w="60" w:type="dxa"/>
-              <w:right w:w="60" w:type="dxa"/>
-            </w:tcMar>
-            <w:tcBorders>
-              <w:top w:val="nil"/>
-              <w:left w:val="nil"/>
-              <w:right w:val="nil"/>
-              <w:bottom w:val="single" w:sz="4" w:color="E4DFD5"/>
-            </w:tcBorders>
-          </w:tcPr>
-          <w:p>
-            <w:r>
-              <w:rPr>
-                <w:rFonts w:ascii="Sora" w:hAnsi="Sora"/>
-                <w:b w:val="0"/>
-                <w:caps w:val="0"/>
-                <w:color w:val="1A1A1A"/>
-                <w:sz w:val="19"/>
-              </w:rPr>
-              <w:t>AI Score</w:t>
-            </w:r>
-          </w:p>
-        </w:tc>
-        <w:tc>
-          <w:tcPr>
-            <w:tcW w:type="dxa" w:w="792"/>
-            <w:shd w:val="clear" w:color="auto" w:fill="F5F5F5"/>
-            <w:tcMar>
-              <w:top w:w="40" w:type="dxa"/>
-              <w:bottom w:w="40" w:type="dxa"/>
-              <w:left w:w="60" w:type="dxa"/>
-              <w:right w:w="60" w:type="dxa"/>
-            </w:tcMar>
-            <w:tcBorders>
-              <w:top w:val="nil"/>
-              <w:left w:val="nil"/>
-              <w:right w:val="nil"/>
-              <w:bottom w:val="single" w:sz="4" w:color="E4DFD5"/>
-            </w:tcBorders>
-          </w:tcPr>
-          <w:p>
-            <w:r>
-              <w:rPr>
-                <w:rFonts w:ascii="Sora" w:hAnsi="Sora"/>
-                <w:b/>
-                <w:caps w:val="0"/>
-                <w:color w:val="1A1A1A"/>
-                <w:sz w:val="19"/>
-              </w:rPr>
-              <w:t>3.5</w:t>
-            </w:r>
-            <w:r>
-              <w:rPr>
-                <w:rFonts w:ascii="Sora" w:hAnsi="Sora"/>
-                <w:b w:val="0"/>
-                <w:caps w:val="0"/>
-                <w:color w:val="828282"/>
-                <w:sz w:val="17"/>
-              </w:rPr>
-              <w:t xml:space="preserve"> / 4</w:t>
-            </w:r>
-          </w:p>
-        </w:tc>
-        <w:tc>
-          <w:tcPr>
-            <w:tcW w:type="dxa" w:w="5904"/>
-            <w:shd w:val="clear" w:color="auto" w:fill="F5F5F5"/>
-            <w:tcMar>
-              <w:top w:w="40" w:type="dxa"/>
-              <w:bottom w:w="40" w:type="dxa"/>
-              <w:left w:w="60" w:type="dxa"/>
-              <w:right w:w="60" w:type="dxa"/>
-            </w:tcMar>
-            <w:tcBorders>
-              <w:top w:val="nil"/>
-              <w:left w:val="nil"/>
-              <w:right w:val="nil"/>
-              <w:bottom w:val="single" w:sz="4" w:color="E4DFD5"/>
-            </w:tcBorders>
-          </w:tcPr>
-          <w:p>
-            <w:r>
-              <w:rPr>
-                <w:rFonts w:ascii="Sora" w:hAnsi="Sora"/>
-                <w:b w:val="0"/>
-                <w:caps w:val="0"/>
-                <w:color w:val="3C3C3C"/>
-                <w:sz w:val="18"/>
-              </w:rPr>
-              <w:t>Proprietary generative and physics-based models plus a scientific data engine make AI structural to CuspAI's materials platform, not a thin wrapper on foundation models.[6][18]</w:t>
-            </w:r>
-          </w:p>
-        </w:tc>
-      </w:tr>
-      <w:tr>
-        <w:tc>
-          <w:tcPr>
-            <w:tcW w:type="dxa" w:w="2664"/>
-            <w:shd w:val="clear" w:color="auto" w:fill="FFFFFF"/>
-            <w:tcMar>
-              <w:top w:w="40" w:type="dxa"/>
-              <w:bottom w:w="40" w:type="dxa"/>
-              <w:left w:w="60" w:type="dxa"/>
-              <w:right w:w="60" w:type="dxa"/>
-            </w:tcMar>
-            <w:tcBorders>
-              <w:top w:val="nil"/>
-              <w:left w:val="nil"/>
-              <w:right w:val="nil"/>
-              <w:bottom w:val="single" w:sz="4" w:color="E4DFD5"/>
-            </w:tcBorders>
-          </w:tcPr>
-          <w:p>
-            <w:r>
-              <w:rPr>
-                <w:rFonts w:ascii="Sora" w:hAnsi="Sora"/>
-                <w:b w:val="0"/>
-                <w:caps w:val="0"/>
-                <w:color w:val="1A1A1A"/>
-                <w:sz w:val="19"/>
-              </w:rPr>
-              <w:t>Terms</w:t>
-            </w:r>
-          </w:p>
-        </w:tc>
-        <w:tc>
-          <w:tcPr>
-            <w:tcW w:type="dxa" w:w="792"/>
-            <w:shd w:val="clear" w:color="auto" w:fill="FFFFFF"/>
-            <w:tcMar>
-              <w:top w:w="40" w:type="dxa"/>
-              <w:bottom w:w="40" w:type="dxa"/>
-              <w:left w:w="60" w:type="dxa"/>
-              <w:right w:w="60" w:type="dxa"/>
-            </w:tcMar>
-            <w:tcBorders>
-              <w:top w:val="nil"/>
-              <w:left w:val="nil"/>
-              <w:right w:val="nil"/>
-              <w:bottom w:val="single" w:sz="4" w:color="E4DFD5"/>
-            </w:tcBorders>
-          </w:tcPr>
-          <w:p>
-            <w:r>
-              <w:rPr>
-                <w:rFonts w:ascii="Sora" w:hAnsi="Sora"/>
-                <w:b/>
-                <w:caps w:val="0"/>
-                <w:color w:val="1A1A1A"/>
-                <w:sz w:val="19"/>
-              </w:rPr>
-              <w:t>3.0</w:t>
-            </w:r>
-            <w:r>
-              <w:rPr>
-                <w:rFonts w:ascii="Sora" w:hAnsi="Sora"/>
-                <w:b w:val="0"/>
-                <w:caps w:val="0"/>
-                <w:color w:val="828282"/>
-                <w:sz w:val="17"/>
-              </w:rPr>
-              <w:t xml:space="preserve"> / 4</w:t>
-            </w:r>
-          </w:p>
-        </w:tc>
-        <w:tc>
-          <w:tcPr>
-            <w:tcW w:type="dxa" w:w="5904"/>
-            <w:shd w:val="clear" w:color="auto" w:fill="FFFFFF"/>
-            <w:tcMar>
-              <w:top w:w="40" w:type="dxa"/>
-              <w:bottom w:w="40" w:type="dxa"/>
-              <w:left w:w="60" w:type="dxa"/>
-              <w:right w:w="60" w:type="dxa"/>
-            </w:tcMar>
-            <w:tcBorders>
-              <w:top w:val="nil"/>
-              <w:left w:val="nil"/>
-              <w:right w:val="nil"/>
-              <w:bottom w:val="single" w:sz="4" w:color="E4DFD5"/>
-            </w:tcBorders>
-          </w:tcPr>
-          <w:p>
-            <w:r>
-              <w:rPr>
-                <w:rFonts w:ascii="Sora" w:hAnsi="Sora"/>
-                <w:b w:val="0"/>
-                <w:caps w:val="0"/>
-                <w:color w:val="3C3C3C"/>
-                <w:sz w:val="18"/>
-              </w:rPr>
-              <w:t>No public SPV or fee information appears; in absence of adverse signals, terms are assumed to be standard co-invest economics with typical venture protections.[3][10][13]</w:t>
-            </w:r>
-          </w:p>
-        </w:tc>
-      </w:tr>
-      <w:tr>
-        <w:tc>
-          <w:tcPr>
-            <w:tcW w:type="dxa" w:w="2664"/>
-            <w:shd w:val="clear" w:color="auto" w:fill="F5F5F5"/>
-            <w:tcMar>
-              <w:top w:w="40" w:type="dxa"/>
-              <w:bottom w:w="40" w:type="dxa"/>
-              <w:left w:w="60" w:type="dxa"/>
-              <w:right w:w="60" w:type="dxa"/>
-            </w:tcMar>
-            <w:tcBorders>
-              <w:top w:val="nil"/>
-              <w:left w:val="nil"/>
-              <w:right w:val="nil"/>
-              <w:bottom w:val="single" w:sz="4" w:color="E4DFD5"/>
-            </w:tcBorders>
-          </w:tcPr>
-          <w:p>
-            <w:r>
-              <w:rPr>
-                <w:rFonts w:ascii="Sora" w:hAnsi="Sora"/>
-                <w:b w:val="0"/>
-                <w:caps w:val="0"/>
-                <w:color w:val="1A1A1A"/>
-                <w:sz w:val="19"/>
-              </w:rPr>
-              <w:t>Fundamentals</w:t>
-            </w:r>
-          </w:p>
-        </w:tc>
-        <w:tc>
-          <w:tcPr>
-            <w:tcW w:type="dxa" w:w="792"/>
-            <w:shd w:val="clear" w:color="auto" w:fill="F5F5F5"/>
-            <w:tcMar>
-              <w:top w:w="40" w:type="dxa"/>
-              <w:bottom w:w="40" w:type="dxa"/>
-              <w:left w:w="60" w:type="dxa"/>
-              <w:right w:w="60" w:type="dxa"/>
-            </w:tcMar>
-            <w:tcBorders>
-              <w:top w:val="nil"/>
-              <w:left w:val="nil"/>
-              <w:right w:val="nil"/>
-              <w:bottom w:val="single" w:sz="4" w:color="E4DFD5"/>
-            </w:tcBorders>
-          </w:tcPr>
-          <w:p>
-            <w:r>
-              <w:rPr>
-                <w:rFonts w:ascii="Sora" w:hAnsi="Sora"/>
-                <w:b/>
-                <w:caps w:val="0"/>
-                <w:color w:val="1A1A1A"/>
-                <w:sz w:val="19"/>
-              </w:rPr>
-              <w:t>2.6</w:t>
-            </w:r>
-            <w:r>
-              <w:rPr>
-                <w:rFonts w:ascii="Sora" w:hAnsi="Sora"/>
-                <w:b w:val="0"/>
-                <w:caps w:val="0"/>
-                <w:color w:val="828282"/>
-                <w:sz w:val="17"/>
-              </w:rPr>
-              <w:t xml:space="preserve"> / 4</w:t>
-            </w:r>
-          </w:p>
-        </w:tc>
-        <w:tc>
-          <w:tcPr>
-            <w:tcW w:type="dxa" w:w="5904"/>
-            <w:shd w:val="clear" w:color="auto" w:fill="F5F5F5"/>
-            <w:tcMar>
-              <w:top w:w="40" w:type="dxa"/>
-              <w:bottom w:w="40" w:type="dxa"/>
-              <w:left w:w="60" w:type="dxa"/>
-              <w:right w:w="60" w:type="dxa"/>
-            </w:tcMar>
-            <w:tcBorders>
-              <w:top w:val="nil"/>
-              <w:left w:val="nil"/>
-              <w:right w:val="nil"/>
-              <w:bottom w:val="single" w:sz="4" w:color="E4DFD5"/>
-            </w:tcBorders>
-          </w:tcPr>
-          <w:p>
-            <w:r>
-              <w:rPr>
-                <w:rFonts w:ascii="Sora" w:hAnsi="Sora"/>
-                <w:b w:val="0"/>
-                <w:caps w:val="0"/>
-                <w:color w:val="3C3C3C"/>
-                <w:sz w:val="18"/>
-              </w:rPr>
-              <w:t>Fundamentals are promising but thinly disclosed, with early-stage revenue likely below $25M, strong TAM and moat signals, diversified partnerships, and a $2.6B Series B valuation.[1][2][3]</w:t>
-            </w:r>
-          </w:p>
-        </w:tc>
-      </w:tr>
-      <w:tr>
-        <w:tc>
-          <w:tcPr>
-            <w:tcW w:type="dxa" w:w="2664"/>
-            <w:shd w:val="clear" w:color="auto" w:fill="FFFFFF"/>
-            <w:tcMar>
-              <w:top w:w="40" w:type="dxa"/>
-              <w:bottom w:w="40" w:type="dxa"/>
-              <w:left w:w="60" w:type="dxa"/>
-              <w:right w:w="60" w:type="dxa"/>
-            </w:tcMar>
-            <w:tcBorders>
-              <w:top w:val="nil"/>
-              <w:left w:val="nil"/>
-              <w:right w:val="nil"/>
-              <w:bottom w:val="single" w:sz="4" w:color="E4DFD5"/>
-            </w:tcBorders>
-          </w:tcPr>
-          <w:p>
-            <w:r>
-              <w:rPr>
-                <w:rFonts w:ascii="Sora" w:hAnsi="Sora"/>
-                <w:b w:val="0"/>
-                <w:caps w:val="0"/>
-                <w:color w:val="1A1A1A"/>
-                <w:sz w:val="19"/>
-              </w:rPr>
-              <w:t>Return Potential</w:t>
-            </w:r>
-          </w:p>
-        </w:tc>
-        <w:tc>
-          <w:tcPr>
-            <w:tcW w:type="dxa" w:w="792"/>
-            <w:shd w:val="clear" w:color="auto" w:fill="FFFFFF"/>
-            <w:tcMar>
-              <w:top w:w="40" w:type="dxa"/>
-              <w:bottom w:w="40" w:type="dxa"/>
-              <w:left w:w="60" w:type="dxa"/>
-              <w:right w:w="60" w:type="dxa"/>
-            </w:tcMar>
-            <w:tcBorders>
-              <w:top w:val="nil"/>
-              <w:left w:val="nil"/>
-              <w:right w:val="nil"/>
-              <w:bottom w:val="single" w:sz="4" w:color="E4DFD5"/>
-            </w:tcBorders>
-          </w:tcPr>
-          <w:p>
-            <w:r>
-              <w:rPr>
-                <w:rFonts w:ascii="Sora" w:hAnsi="Sora"/>
-                <w:b/>
-                <w:caps w:val="0"/>
-                <w:color w:val="1A1A1A"/>
-                <w:sz w:val="19"/>
-              </w:rPr>
-              <w:t>2.8</w:t>
-            </w:r>
-            <w:r>
-              <w:rPr>
-                <w:rFonts w:ascii="Sora" w:hAnsi="Sora"/>
-                <w:b w:val="0"/>
-                <w:caps w:val="0"/>
-                <w:color w:val="828282"/>
-                <w:sz w:val="17"/>
-              </w:rPr>
-              <w:t xml:space="preserve"> / 4</w:t>
-            </w:r>
-          </w:p>
-        </w:tc>
-        <w:tc>
-          <w:tcPr>
-            <w:tcW w:type="dxa" w:w="5904"/>
-            <w:shd w:val="clear" w:color="auto" w:fill="FFFFFF"/>
-            <w:tcMar>
-              <w:top w:w="40" w:type="dxa"/>
-              <w:bottom w:w="40" w:type="dxa"/>
-              <w:left w:w="60" w:type="dxa"/>
-              <w:right w:w="60" w:type="dxa"/>
-            </w:tcMar>
-            <w:tcBorders>
-              <w:top w:val="nil"/>
-              <w:left w:val="nil"/>
-              <w:right w:val="nil"/>
-              <w:bottom w:val="single" w:sz="4" w:color="E4DFD5"/>
-            </w:tcBorders>
-          </w:tcPr>
-          <w:p>
-            <w:r>
-              <w:rPr>
-                <w:rFonts w:ascii="Sora" w:hAnsi="Sora"/>
-                <w:b w:val="0"/>
-                <w:caps w:val="0"/>
-                <w:color w:val="3C3C3C"/>
-                <w:sz w:val="18"/>
-              </w:rPr>
-              <w:t>Despite rich entry pricing, scaling AI materials discovery across industries could plausibly support a 3-6x base-case MOIC with standard downside protection.[1][2][20]</w:t>
-            </w:r>
-          </w:p>
-        </w:tc>
-      </w:tr>
     </w:tbl>
     <w:p>
       <w:pPr>
@@ -834,7 +222,7 @@
           <w:color w:val="1A1A1A"/>
           <w:sz w:val="21"/>
         </w:rPr>
-        <w:t>CuspAI fits ID8’s thesis with a new-money Tier 1 co-lead (Kleiner Perkins) at Series B and a genuinely structural AI-driven materials platform.[3][4][10] Fundamentals are still early and thinly disclosed, but TAM, team and moat suggest real upside.[1][2][6]</w:t>
+        <w:t>scoring failed: 401 Client Error: Unauthorized for url: https://api.perplexity.ai/chat/completions</w:t>
       </w:r>
     </w:p>
     <w:p>
@@ -849,7 +237,7 @@
           <w:color w:val="828282"/>
           <w:sz w:val="18"/>
         </w:rPr>
-        <w:t>Confidence: medium</w:t>
+        <w:t>Confidence: low</w:t>
       </w:r>
     </w:p>
     <w:sectPr>

</xml_diff>